<commit_message>
Add Gmail contact and polish detailed CVs
Include nracheal017@gmail.com in contacts, place languages above the profile, add the e-signature, and use Page X of Y footers.

Co-authored-by: Cursor <cursoragent@cursor.com>
</commit_message>
<xml_diff>
--- a/racheal_cv/detailed_versions/racheal_nabukeera_academic_leadership_word.docx
+++ b/racheal_cv/detailed_versions/racheal_nabukeera_academic_leadership_word.docx
@@ -91,7 +91,7 @@
                 <w:color w:val="607080"/>
                 <w:sz w:val="17"/>
               </w:rPr>
-              <w:t>Email: info@fairbanksmedicalcentre.org</w:t>
+              <w:t>Email: info@fairbanksmedicalcentre.org | nracheal017@gmail.com</w:t>
             </w:r>
           </w:p>
           <w:p>
@@ -177,6 +177,53 @@
           <w:color w:val="5B2434"/>
           <w:sz w:val="23"/>
         </w:rPr>
+        <w:t>LANGUAGES</w:t>
+      </w:r>
+    </w:p>
+    <w:p>
+      <w:pPr>
+        <w:pStyle w:val="ListBullet"/>
+        <w:spacing w:after="40" w:line="252" w:lineRule="auto"/>
+      </w:pPr>
+      <w:r>
+        <w:rPr>
+          <w:rFonts w:ascii="Times New Roman" w:hAnsi="Times New Roman" w:eastAsia="Times New Roman"/>
+          <w:b w:val="0"/>
+          <w:color w:val="25313D"/>
+          <w:sz w:val="18"/>
+        </w:rPr>
+        <w:t>English - Fluent</w:t>
+      </w:r>
+    </w:p>
+    <w:p>
+      <w:pPr>
+        <w:pStyle w:val="ListBullet"/>
+        <w:spacing w:after="40" w:line="252" w:lineRule="auto"/>
+      </w:pPr>
+      <w:r>
+        <w:rPr>
+          <w:rFonts w:ascii="Times New Roman" w:hAnsi="Times New Roman" w:eastAsia="Times New Roman"/>
+          <w:b w:val="0"/>
+          <w:color w:val="25313D"/>
+          <w:sz w:val="18"/>
+        </w:rPr>
+        <w:t>Luganda - Fluent</w:t>
+      </w:r>
+    </w:p>
+    <w:p>
+      <w:pPr>
+        <w:spacing w:before="200" w:after="100"/>
+        <w:pBdr>
+          <w:bottom w:val="single" w:sz="12" w:color="C39B58"/>
+        </w:pBdr>
+      </w:pPr>
+      <w:r>
+        <w:rPr>
+          <w:rFonts w:ascii="Arial" w:hAnsi="Arial" w:eastAsia="Arial"/>
+          <w:b/>
+          <w:color w:val="5B2434"/>
+          <w:sz w:val="23"/>
+        </w:rPr>
         <w:t>EXECUTIVE PROFILE</w:t>
       </w:r>
     </w:p>
@@ -3001,53 +3048,61 @@
     </w:p>
     <w:p>
       <w:pPr>
-        <w:spacing w:before="200" w:after="100"/>
-        <w:pBdr>
-          <w:bottom w:val="single" w:sz="12" w:color="C39B58"/>
-        </w:pBdr>
+        <w:spacing w:before="280" w:after="40"/>
+        <w:jc w:val="right"/>
       </w:pPr>
       <w:r>
         <w:rPr>
           <w:rFonts w:ascii="Arial" w:hAnsi="Arial" w:eastAsia="Arial"/>
-          <w:b/>
-          <w:color w:val="5B2434"/>
-          <w:sz w:val="23"/>
+          <w:b w:val="0"/>
+          <w:color w:val="607080"/>
+          <w:sz w:val="16"/>
         </w:rPr>
-        <w:t>LANGUAGES</w:t>
+        <w:t>Signature</w:t>
       </w:r>
     </w:p>
     <w:p>
       <w:pPr>
-        <w:pStyle w:val="ListBullet"/>
-        <w:spacing w:after="40" w:line="252" w:lineRule="auto"/>
+        <w:spacing w:after="0"/>
+        <w:jc w:val="right"/>
       </w:pPr>
       <w:r>
-        <w:rPr>
-          <w:rFonts w:ascii="Times New Roman" w:hAnsi="Times New Roman" w:eastAsia="Times New Roman"/>
-          <w:b w:val="0"/>
-          <w:color w:val="25313D"/>
-          <w:sz w:val="18"/>
-        </w:rPr>
-        <w:t>English - Fluent</w:t>
-      </w:r>
-    </w:p>
-    <w:p>
-      <w:pPr>
-        <w:pStyle w:val="ListBullet"/>
-        <w:spacing w:after="40" w:line="252" w:lineRule="auto"/>
-      </w:pPr>
-      <w:r>
-        <w:rPr>
-          <w:rFonts w:ascii="Times New Roman" w:hAnsi="Times New Roman" w:eastAsia="Times New Roman"/>
-          <w:b w:val="0"/>
-          <w:color w:val="25313D"/>
-          <w:sz w:val="18"/>
-        </w:rPr>
-        <w:t>Luganda - Fluent</w:t>
+        <w:drawing>
+          <wp:inline xmlns:a="http://schemas.openxmlformats.org/drawingml/2006/main" xmlns:pic="http://schemas.openxmlformats.org/drawingml/2006/picture">
+            <wp:extent cx="1280160" cy="997146"/>
+            <wp:docPr id="2" name="Picture 2"/>
+            <wp:cNvGraphicFramePr>
+              <a:graphicFrameLocks noChangeAspect="1"/>
+            </wp:cNvGraphicFramePr>
+            <a:graphic>
+              <a:graphicData uri="http://schemas.openxmlformats.org/drawingml/2006/picture">
+                <pic:pic>
+                  <pic:nvPicPr>
+                    <pic:cNvPr id="0" name="signature.jpeg"/>
+                    <pic:cNvPicPr/>
+                  </pic:nvPicPr>
+                  <pic:blipFill>
+                    <a:blip r:embed="rId10"/>
+                    <a:stretch>
+                      <a:fillRect/>
+                    </a:stretch>
+                  </pic:blipFill>
+                  <pic:spPr>
+                    <a:xfrm>
+                      <a:off x="0" y="0"/>
+                      <a:ext cx="1280160" cy="997146"/>
+                    </a:xfrm>
+                    <a:prstGeom prst="rect"/>
+                  </pic:spPr>
+                </pic:pic>
+              </a:graphicData>
+            </a:graphic>
+          </wp:inline>
+        </w:drawing>
       </w:r>
     </w:p>
     <w:sectPr>
-      <w:footerReference w:type="default" r:id="rId10"/>
+      <w:footerReference w:type="default" r:id="rId11"/>
       <w:pgSz w:w="12240" w:h="15840"/>
       <w:pgMar w:top="680" w:right="850" w:bottom="709" w:left="850" w:header="720" w:footer="720" w:gutter="0"/>
       <w:cols w:space="720"/>
@@ -3076,6 +3131,22 @@
     <w:r>
       <w:fldChar w:fldCharType="begin"/>
       <w:instrText xml:space="preserve"> PAGE </w:instrText>
+      <w:fldChar w:fldCharType="separate"/>
+      <w:fldChar w:fldCharType="end"/>
+    </w:r>
+    <w:r>
+      <w:rPr>
+        <w:rFonts w:ascii="Arial" w:hAnsi="Arial" w:eastAsia="Arial"/>
+        <w:b w:val="0"/>
+        <w:color w:val="607080"/>
+        <w:sz w:val="16"/>
+      </w:rPr>
+      <w:t xml:space="preserve"> of </w:t>
+    </w:r>
+    <w:r>
+      <w:fldChar w:fldCharType="begin"/>
+      <w:instrText xml:space="preserve"> NUMPAGES </w:instrText>
+      <w:fldChar w:fldCharType="separate"/>
       <w:fldChar w:fldCharType="end"/>
     </w:r>
   </w:p>

</xml_diff>

<commit_message>
Keep detailed CV signatures on page 5
Use a compact signing block so every detailed design stays five pages with a proper signature at the bottom.

Co-authored-by: Cursor <cursoragent@cursor.com>
</commit_message>
<xml_diff>
--- a/racheal_cv/detailed_versions/racheal_nabukeera_academic_leadership_word.docx
+++ b/racheal_cv/detailed_versions/racheal_nabukeera_academic_leadership_word.docx
@@ -3048,7 +3048,7 @@
     </w:p>
     <w:p>
       <w:pPr>
-        <w:spacing w:before="280" w:after="40"/>
+        <w:spacing w:before="200" w:after="20"/>
         <w:jc w:val="right"/>
       </w:pPr>
       <w:r>
@@ -3058,18 +3058,18 @@
           <w:color w:val="607080"/>
           <w:sz w:val="16"/>
         </w:rPr>
-        <w:t>Signature</w:t>
+        <w:t>Signed</w:t>
       </w:r>
     </w:p>
     <w:p>
       <w:pPr>
-        <w:spacing w:after="0"/>
+        <w:spacing w:after="20"/>
         <w:jc w:val="right"/>
       </w:pPr>
       <w:r>
         <w:drawing>
           <wp:inline xmlns:a="http://schemas.openxmlformats.org/drawingml/2006/main" xmlns:pic="http://schemas.openxmlformats.org/drawingml/2006/picture">
-            <wp:extent cx="1280160" cy="997146"/>
+            <wp:extent cx="1051560" cy="819085"/>
             <wp:docPr id="2" name="Picture 2"/>
             <wp:cNvGraphicFramePr>
               <a:graphicFrameLocks noChangeAspect="1"/>
@@ -3090,7 +3090,7 @@
                   <pic:spPr>
                     <a:xfrm>
                       <a:off x="0" y="0"/>
-                      <a:ext cx="1280160" cy="997146"/>
+                      <a:ext cx="1051560" cy="819085"/>
                     </a:xfrm>
                     <a:prstGeom prst="rect"/>
                   </pic:spPr>
@@ -3099,6 +3099,21 @@
             </a:graphic>
           </wp:inline>
         </w:drawing>
+      </w:r>
+    </w:p>
+    <w:p>
+      <w:pPr>
+        <w:spacing w:after="0"/>
+        <w:jc w:val="right"/>
+      </w:pPr>
+      <w:r>
+        <w:rPr>
+          <w:rFonts w:ascii="Arial" w:hAnsi="Arial" w:eastAsia="Arial"/>
+          <w:b/>
+          <w:color w:val="5B2434"/>
+          <w:sz w:val="18"/>
+        </w:rPr>
+        <w:t>Racheal Nabukeera</w:t>
       </w:r>
     </w:p>
     <w:sectPr>

</xml_diff>